<commit_message>
Add ForgetPAssword in DeveloperNotes
</commit_message>
<xml_diff>
--- a/FarmoDeveloperNotes.docx
+++ b/FarmoDeveloperNotes.docx
@@ -1125,21 +1125,7 @@
         <w:rPr>
           <w:szCs w:val="24"/>
         </w:rPr>
-        <w:t xml:space="preserve">– the profile </w:t>
-      </w:r>
-      <w:proofErr w:type="gramStart"/>
-      <w:r>
-        <w:rPr>
-          <w:szCs w:val="24"/>
-        </w:rPr>
-        <w:t>is created</w:t>
-      </w:r>
-      <w:proofErr w:type="gramEnd"/>
-      <w:r>
-        <w:rPr>
-          <w:szCs w:val="24"/>
-        </w:rPr>
-        <w:t xml:space="preserve"> but not yet reviewed or approved.</w:t>
+        <w:t>– the profile is created but not yet reviewed or approved.</w:t>
       </w:r>
     </w:p>
     <w:p>
@@ -1184,21 +1170,7 @@
         <w:rPr>
           <w:szCs w:val="24"/>
         </w:rPr>
-        <w:t xml:space="preserve">– the profile </w:t>
-      </w:r>
-      <w:proofErr w:type="gramStart"/>
-      <w:r>
-        <w:rPr>
-          <w:szCs w:val="24"/>
-        </w:rPr>
-        <w:t>is verified</w:t>
-      </w:r>
-      <w:proofErr w:type="gramEnd"/>
-      <w:r>
-        <w:rPr>
-          <w:szCs w:val="24"/>
-        </w:rPr>
-        <w:t xml:space="preserve"> and currently in use.</w:t>
+        <w:t>– the profile is verified and currently in use.</w:t>
       </w:r>
     </w:p>
     <w:p>
@@ -1243,21 +1215,7 @@
         <w:rPr>
           <w:szCs w:val="24"/>
         </w:rPr>
-        <w:t xml:space="preserve">– the profile </w:t>
-      </w:r>
-      <w:proofErr w:type="gramStart"/>
-      <w:r>
-        <w:rPr>
-          <w:szCs w:val="24"/>
-        </w:rPr>
-        <w:t>is temporarily disabled</w:t>
-      </w:r>
-      <w:proofErr w:type="gramEnd"/>
-      <w:r>
-        <w:rPr>
-          <w:szCs w:val="24"/>
-        </w:rPr>
-        <w:t xml:space="preserve"> due to issues or violations.</w:t>
+        <w:t>– the profile is temporarily disabled due to issues or violations.</w:t>
       </w:r>
     </w:p>
     <w:p>
@@ -1302,30 +1260,8 @@
         <w:rPr>
           <w:szCs w:val="24"/>
         </w:rPr>
-        <w:t xml:space="preserve">– the profile has </w:t>
-      </w:r>
-      <w:proofErr w:type="gramStart"/>
-      <w:r>
-        <w:rPr>
-          <w:szCs w:val="24"/>
-        </w:rPr>
-        <w:t>been removed</w:t>
-      </w:r>
-      <w:proofErr w:type="gramEnd"/>
-      <w:r>
-        <w:rPr>
-          <w:szCs w:val="24"/>
-        </w:rPr>
-        <w:t xml:space="preserve"> or deactivated </w:t>
-      </w:r>
-      <w:proofErr w:type="gramStart"/>
-      <w:r>
-        <w:rPr>
-          <w:szCs w:val="24"/>
-        </w:rPr>
-        <w:t>permanently</w:t>
-      </w:r>
-      <w:proofErr w:type="gramEnd"/>
+        <w:t>– the profile has been removed or deactivated permanently</w:t>
+      </w:r>
     </w:p>
     <w:p>
       <w:pPr>
@@ -2091,30 +2027,8 @@
         <w:rPr>
           <w:u w:val="none"/>
         </w:rPr>
-        <w:t>Error code, terms inside “…</w:t>
-      </w:r>
-      <w:proofErr w:type="gramStart"/>
-      <w:r>
-        <w:rPr>
-          <w:u w:val="none"/>
-        </w:rPr>
-        <w:t>”,</w:t>
-      </w:r>
-      <w:proofErr w:type="gramEnd"/>
-      <w:r>
-        <w:rPr>
-          <w:u w:val="none"/>
-        </w:rPr>
-        <w:t xml:space="preserve"> </w:t>
-      </w:r>
-      <w:proofErr w:type="gramStart"/>
-      <w:r>
-        <w:rPr>
-          <w:u w:val="none"/>
-        </w:rPr>
-        <w:t>etc.</w:t>
-      </w:r>
-      <w:proofErr w:type="gramEnd"/>
+        <w:t>Error code, terms inside “…”, etc.</w:t>
+      </w:r>
     </w:p>
     <w:p/>
     <w:p>
@@ -2187,15 +2101,7 @@
         <w:t xml:space="preserve">: </w:t>
       </w:r>
       <w:r>
-        <w:t xml:space="preserve">To separate all terms from others, they </w:t>
-      </w:r>
-      <w:proofErr w:type="gramStart"/>
-      <w:r>
-        <w:t>are written</w:t>
-      </w:r>
-      <w:proofErr w:type="gramEnd"/>
-      <w:r>
-        <w:t xml:space="preserve"> in</w:t>
+        <w:t>To separate all terms from others, they are written in</w:t>
       </w:r>
       <w:r>
         <w:rPr>
@@ -2252,39 +2158,23 @@
       </w:r>
       <w:proofErr w:type="gramEnd"/>
       <w:r>
-        <w:t xml:space="preserve"> are generally </w:t>
+        <w:t xml:space="preserve"> are generally handled with these HTTP codes. We see </w:t>
       </w:r>
       <w:proofErr w:type="gramStart"/>
       <w:r>
-        <w:t>handled</w:t>
+        <w:t>some where</w:t>
       </w:r>
       <w:proofErr w:type="gramEnd"/>
       <w:r>
-        <w:t xml:space="preserve"> with these HTTP codes. We see </w:t>
+        <w:t xml:space="preserve"> during browsing </w:t>
       </w:r>
       <w:proofErr w:type="gramStart"/>
       <w:r>
-        <w:t>some</w:t>
+        <w:t>404</w:t>
       </w:r>
       <w:proofErr w:type="gramEnd"/>
       <w:r>
-        <w:t xml:space="preserve"> where during browsing </w:t>
-      </w:r>
-      <w:proofErr w:type="gramStart"/>
-      <w:r>
-        <w:t>404</w:t>
-      </w:r>
-      <w:proofErr w:type="gramEnd"/>
-      <w:r>
-        <w:t xml:space="preserve"> </w:t>
-      </w:r>
-      <w:proofErr w:type="gramStart"/>
-      <w:r>
-        <w:t>is not found</w:t>
-      </w:r>
-      <w:proofErr w:type="gramEnd"/>
-      <w:r>
-        <w:t xml:space="preserve"> like that. </w:t>
+        <w:t xml:space="preserve"> is not found like that. </w:t>
       </w:r>
     </w:p>
     <w:p>
@@ -2318,13 +2208,8 @@
         <w:t xml:space="preserve">Continue </w:t>
       </w:r>
       <w:r>
-        <w:t xml:space="preserve">→ invalid </w:t>
-      </w:r>
-      <w:proofErr w:type="gramStart"/>
-      <w:r>
-        <w:t>input</w:t>
-      </w:r>
-      <w:proofErr w:type="gramEnd"/>
+        <w:t>→ invalid input</w:t>
+      </w:r>
     </w:p>
     <w:p>
       <w:pPr>
@@ -2470,13 +2355,8 @@
         <w:t>User Not Found</w:t>
       </w:r>
       <w:r>
-        <w:t xml:space="preserve"> → invalid </w:t>
-      </w:r>
-      <w:proofErr w:type="gramStart"/>
-      <w:r>
-        <w:t>input</w:t>
-      </w:r>
-      <w:proofErr w:type="gramEnd"/>
+        <w:t xml:space="preserve"> → invalid input</w:t>
+      </w:r>
     </w:p>
     <w:p>
       <w:pPr>
@@ -2502,13 +2382,8 @@
         <w:t>6 Not Accepted</w:t>
       </w:r>
       <w:r>
-        <w:t xml:space="preserve"> → invalid </w:t>
-      </w:r>
-      <w:proofErr w:type="gramStart"/>
-      <w:r>
-        <w:t>input</w:t>
-      </w:r>
-      <w:proofErr w:type="gramEnd"/>
+        <w:t xml:space="preserve"> → invalid input</w:t>
+      </w:r>
     </w:p>
     <w:p>
       <w:pPr>
@@ -2539,21 +2414,12 @@
         </w:numPr>
         <w:jc w:val="left"/>
       </w:pPr>
-      <w:proofErr w:type="gramStart"/>
       <w:r>
         <w:rPr>
           <w:b/>
           <w:bCs/>
         </w:rPr>
-        <w:t>And so on</w:t>
-      </w:r>
-      <w:proofErr w:type="gramEnd"/>
-      <w:r>
-        <w:rPr>
-          <w:b/>
-          <w:bCs/>
-        </w:rPr>
-        <w:t xml:space="preserve">. </w:t>
+        <w:t xml:space="preserve">And so on. </w:t>
       </w:r>
     </w:p>
     <w:p>
@@ -3899,26 +3765,22 @@
       </w:r>
       <w:proofErr w:type="gramEnd"/>
       <w:r>
-        <w:t xml:space="preserve"> of data internally in system </w:t>
-      </w:r>
-      <w:proofErr w:type="gramStart"/>
-      <w:r>
-        <w:t>i.e</w:t>
+        <w:t xml:space="preserve"> of data internally in system i.e</w:t>
       </w:r>
       <w:r>
         <w:rPr>
           <w:b/>
           <w:bCs/>
         </w:rPr>
-        <w:t>.</w:t>
-      </w:r>
-      <w:proofErr w:type="gramEnd"/>
+        <w:t xml:space="preserve">. </w:t>
+      </w:r>
       <w:r>
         <w:rPr>
           <w:b/>
           <w:bCs/>
-        </w:rPr>
-        <w:t xml:space="preserve"> </w:t>
+          <w:color w:val="00B050"/>
+        </w:rPr>
+        <w:t>is_</w:t>
       </w:r>
       <w:r>
         <w:rPr>
@@ -3926,7 +3788,7 @@
           <w:bCs/>
           <w:color w:val="00B050"/>
         </w:rPr>
-        <w:t>is_</w:t>
+        <w:t>a</w:t>
       </w:r>
       <w:r>
         <w:rPr>
@@ -3934,7 +3796,16 @@
           <w:bCs/>
           <w:color w:val="00B050"/>
         </w:rPr>
-        <w:t>a</w:t>
+        <w:t>dmin</w:t>
+      </w:r>
+      <w:r>
+        <w:rPr>
+          <w:color w:val="00B050"/>
+        </w:rPr>
+        <w:t xml:space="preserve"> </w:t>
+      </w:r>
+      <w:r>
+        <w:t xml:space="preserve">and </w:t>
       </w:r>
       <w:r>
         <w:rPr>
@@ -3942,16 +3813,7 @@
           <w:bCs/>
           <w:color w:val="00B050"/>
         </w:rPr>
-        <w:t>dmin</w:t>
-      </w:r>
-      <w:r>
-        <w:rPr>
-          <w:color w:val="00B050"/>
-        </w:rPr>
-        <w:t xml:space="preserve"> </w:t>
-      </w:r>
-      <w:r>
-        <w:t xml:space="preserve">and </w:t>
+        <w:t>d</w:t>
       </w:r>
       <w:r>
         <w:rPr>
@@ -3959,26 +3821,8 @@
           <w:bCs/>
           <w:color w:val="00B050"/>
         </w:rPr>
-        <w:t>d</w:t>
-      </w:r>
-      <w:r>
-        <w:rPr>
-          <w:b/>
-          <w:bCs/>
-          <w:color w:val="00B050"/>
-        </w:rPr>
-        <w:t>evice_</w:t>
-      </w:r>
-      <w:proofErr w:type="gramStart"/>
-      <w:r>
-        <w:rPr>
-          <w:b/>
-          <w:bCs/>
-          <w:color w:val="00B050"/>
-        </w:rPr>
-        <w:t>info</w:t>
-      </w:r>
-      <w:proofErr w:type="gramEnd"/>
+        <w:t>evice_info</w:t>
+      </w:r>
     </w:p>
     <w:p>
       <w:pPr>
@@ -5086,53 +4930,48 @@
       </w:r>
     </w:p>
     <w:p>
+      <w:r>
+        <w:t>Generally</w:t>
+      </w:r>
+      <w:r>
+        <w:t>,</w:t>
+      </w:r>
+      <w:r>
+        <w:t xml:space="preserve"> user send </w:t>
+      </w:r>
+      <w:r>
+        <w:t>“</w:t>
+      </w:r>
+      <w:r>
+        <w:t>token</w:t>
+      </w:r>
+      <w:r>
+        <w:t>”</w:t>
+      </w:r>
+      <w:r>
+        <w:t xml:space="preserve"> and </w:t>
+      </w:r>
+      <w:r>
+        <w:t>“</w:t>
+      </w:r>
+      <w:r>
+        <w:t>userID</w:t>
+      </w:r>
+      <w:r>
+        <w:t>” for login.</w:t>
+      </w:r>
+    </w:p>
+    <w:p>
+      <w:r>
+        <w:t xml:space="preserve"> If token </w:t>
+      </w:r>
       <w:proofErr w:type="gramStart"/>
       <w:r>
-        <w:t>Generally</w:t>
-      </w:r>
-      <w:r>
-        <w:t>,</w:t>
-      </w:r>
-      <w:r>
-        <w:t xml:space="preserve"> user</w:t>
+        <w:t>is expired</w:t>
       </w:r>
       <w:proofErr w:type="gramEnd"/>
       <w:r>
-        <w:t xml:space="preserve"> send </w:t>
-      </w:r>
-      <w:r>
-        <w:t>“</w:t>
-      </w:r>
-      <w:r>
-        <w:t>token</w:t>
-      </w:r>
-      <w:r>
-        <w:t>”</w:t>
-      </w:r>
-      <w:r>
-        <w:t xml:space="preserve"> and </w:t>
-      </w:r>
-      <w:r>
-        <w:t>“</w:t>
-      </w:r>
-      <w:r>
-        <w:t>userID</w:t>
-      </w:r>
-      <w:r>
-        <w:t>” for login.</w:t>
-      </w:r>
-    </w:p>
-    <w:p>
-      <w:r>
-        <w:t xml:space="preserve"> If token </w:t>
-      </w:r>
-      <w:proofErr w:type="gramStart"/>
-      <w:r>
-        <w:t xml:space="preserve">is expired.  </w:t>
-      </w:r>
-      <w:proofErr w:type="gramEnd"/>
-      <w:r>
-        <w:t xml:space="preserve">Server uses “refresh_token” </w:t>
+        <w:t xml:space="preserve">.  Server uses “refresh_token” </w:t>
       </w:r>
       <w:r>
         <w:t xml:space="preserve">to create new “token” and send back to user. </w:t>
@@ -5408,15 +5247,7 @@
         <w:t xml:space="preserve">ACCOUNT_PENDING </w:t>
       </w:r>
       <w:r>
-        <w:t xml:space="preserve">- Account awaiting </w:t>
-      </w:r>
-      <w:proofErr w:type="gramStart"/>
-      <w:r>
-        <w:t>activation</w:t>
-      </w:r>
-      <w:proofErr w:type="gramEnd"/>
-      <w:r>
-        <w:t xml:space="preserve"> </w:t>
+        <w:t xml:space="preserve">- Account awaiting activation </w:t>
       </w:r>
     </w:p>
     <w:p>
@@ -5446,15 +5277,7 @@
         <w:t xml:space="preserve"> </w:t>
       </w:r>
       <w:r>
-        <w:t>- Account blocked/</w:t>
-      </w:r>
-      <w:proofErr w:type="gramStart"/>
-      <w:r>
-        <w:t>suspended</w:t>
-      </w:r>
-      <w:proofErr w:type="gramEnd"/>
-      <w:r>
-        <w:t xml:space="preserve"> </w:t>
+        <w:t xml:space="preserve">- Account blocked/suspended </w:t>
       </w:r>
     </w:p>
     <w:p>
@@ -5505,15 +5328,7 @@
         <w:t xml:space="preserve"> </w:t>
       </w:r>
       <w:r>
-        <w:t xml:space="preserve">- Token expired or </w:t>
-      </w:r>
-      <w:proofErr w:type="gramStart"/>
-      <w:r>
-        <w:t>invalid</w:t>
-      </w:r>
-      <w:proofErr w:type="gramEnd"/>
-      <w:r>
-        <w:t xml:space="preserve"> </w:t>
+        <w:t xml:space="preserve">- Token expired or invalid </w:t>
       </w:r>
     </w:p>
     <w:p>
@@ -6024,7 +5839,15 @@
     </w:p>
     <w:p>
       <w:r>
-        <w:t xml:space="preserve">It occurs only when Admin creates new user, then admin </w:t>
+        <w:t xml:space="preserve">It occurs only when Admin creates new </w:t>
+      </w:r>
+      <w:proofErr w:type="gramStart"/>
+      <w:r>
+        <w:t>user</w:t>
+      </w:r>
+      <w:proofErr w:type="gramEnd"/>
+      <w:r>
+        <w:t xml:space="preserve">, then admin </w:t>
       </w:r>
       <w:proofErr w:type="gramStart"/>
       <w:r>
@@ -7380,10 +7203,18 @@
     <w:p/>
     <w:p>
       <w:r>
-        <w:t xml:space="preserve">UserID needs to check constantly, </w:t>
+        <w:t xml:space="preserve">UserID needs to </w:t>
       </w:r>
       <w:proofErr w:type="gramStart"/>
       <w:r>
+        <w:t>check</w:t>
+      </w:r>
+      <w:proofErr w:type="gramEnd"/>
+      <w:r>
+        <w:t xml:space="preserve"> constantly, </w:t>
+      </w:r>
+      <w:proofErr w:type="gramStart"/>
+      <w:r>
         <w:t>entered</w:t>
       </w:r>
       <w:proofErr w:type="gramEnd"/>
@@ -7430,15 +7261,7 @@
         <w:jc w:val="left"/>
       </w:pPr>
       <w:r>
-        <w:t xml:space="preserve">Request is to </w:t>
-      </w:r>
-      <w:proofErr w:type="gramStart"/>
-      <w:r>
-        <w:t>be sent</w:t>
-      </w:r>
-      <w:proofErr w:type="gramEnd"/>
-      <w:r>
-        <w:t xml:space="preserve"> in change in every character in textbox.</w:t>
+        <w:t>Request is to be sent in change in every character in textbox.</w:t>
       </w:r>
       <w:r>
         <w:br/>
@@ -7573,13 +7396,8 @@
         <w:ind w:firstLine="720"/>
         <w:jc w:val="left"/>
       </w:pPr>
-      <w:proofErr w:type="gramStart"/>
-      <w:r>
-        <w:t>1</w:t>
-      </w:r>
-      <w:proofErr w:type="gramEnd"/>
-      <w:r>
-        <w:t xml:space="preserve"> </w:t>
+      <w:r>
+        <w:t xml:space="preserve">1 </w:t>
       </w:r>
       <w:r>
         <w:sym w:font="Wingdings" w:char="F0E0"/>
@@ -7596,13 +7414,8 @@
         <w:ind w:firstLine="720"/>
         <w:jc w:val="left"/>
       </w:pPr>
-      <w:proofErr w:type="gramStart"/>
-      <w:r>
-        <w:t>0</w:t>
-      </w:r>
-      <w:proofErr w:type="gramEnd"/>
-      <w:r>
-        <w:t xml:space="preserve"> </w:t>
+      <w:r>
+        <w:t xml:space="preserve">0 </w:t>
       </w:r>
       <w:r>
         <w:sym w:font="Wingdings" w:char="F0E0"/>
@@ -7780,15 +7593,7 @@
         <w:t>-</w:t>
       </w:r>
       <w:r>
-        <w:t xml:space="preserve">admin, admin, </w:t>
-      </w:r>
-      <w:proofErr w:type="gramStart"/>
-      <w:r>
-        <w:t>farmer</w:t>
-      </w:r>
-      <w:proofErr w:type="gramEnd"/>
-      <w:r>
-        <w:t xml:space="preserve"> and consumer [</w:t>
+        <w:t>admin, admin, farmer and consumer [</w:t>
       </w:r>
       <w:r>
         <w:rPr>
@@ -7871,15 +7676,7 @@
     </w:p>
     <w:p>
       <w:r>
-        <w:t xml:space="preserve">In Web four items for Created By [Super Admin, Admin, </w:t>
-      </w:r>
-      <w:proofErr w:type="gramStart"/>
-      <w:r>
-        <w:t>Farmer</w:t>
-      </w:r>
-      <w:proofErr w:type="gramEnd"/>
-      <w:r>
-        <w:t xml:space="preserve"> and Consumer]</w:t>
+        <w:t>In Web four items for Created By [Super Admin, Admin, Farmer and Consumer]</w:t>
       </w:r>
     </w:p>
     <w:p>
@@ -7917,11 +7714,7 @@
         <w:pStyle w:val="Heading2"/>
       </w:pPr>
       <w:r>
-        <w:t xml:space="preserve">First ask for phone or userID in </w:t>
-      </w:r>
-      <w:proofErr w:type="gramStart"/>
-      <w:r>
-        <w:t>1</w:t>
+        <w:t>First ask for phone or userID in 1</w:t>
       </w:r>
       <w:r>
         <w:rPr>
@@ -7929,7 +7722,6 @@
         </w:rPr>
         <w:t>st</w:t>
       </w:r>
-      <w:proofErr w:type="gramEnd"/>
       <w:r>
         <w:t xml:space="preserve"> step.</w:t>
       </w:r>
@@ -8020,13 +7812,8 @@
       <w:r>
         <w:t xml:space="preserve"> </w:t>
       </w:r>
-      <w:proofErr w:type="gramStart"/>
-      <w:r>
-        <w:t>200</w:t>
-      </w:r>
-      <w:proofErr w:type="gramEnd"/>
-      <w:r>
-        <w:t>]</w:t>
+      <w:r>
+        <w:t>200]</w:t>
       </w:r>
     </w:p>
     <w:p>
@@ -8148,13 +7935,8 @@
         <w:jc w:val="left"/>
       </w:pPr>
       <w:r>
-        <w:t xml:space="preserve">show half_email in </w:t>
-      </w:r>
-      <w:proofErr w:type="gramStart"/>
-      <w:r>
-        <w:t>interface</w:t>
-      </w:r>
-      <w:proofErr w:type="gramEnd"/>
+        <w:t>show half_email in interface</w:t>
+      </w:r>
     </w:p>
     <w:p>
       <w:pPr>
@@ -8381,15 +8163,7 @@
         <w:sym w:font="Wingdings" w:char="F0E0"/>
       </w:r>
       <w:r>
-        <w:t xml:space="preserve"> </w:t>
-      </w:r>
-      <w:proofErr w:type="gramStart"/>
-      <w:r>
-        <w:t>200</w:t>
-      </w:r>
-      <w:proofErr w:type="gramEnd"/>
-      <w:r>
-        <w:t>]</w:t>
+        <w:t xml:space="preserve"> 200]</w:t>
       </w:r>
     </w:p>
     <w:p>
@@ -8514,13 +8288,8 @@
       </w:r>
       <w:proofErr w:type="spellEnd"/>
       <w:r>
-        <w:t xml:space="preserve"> in </w:t>
-      </w:r>
-      <w:proofErr w:type="gramStart"/>
-      <w:r>
-        <w:t>email</w:t>
-      </w:r>
-      <w:proofErr w:type="gramEnd"/>
+        <w:t xml:space="preserve"> in email</w:t>
+      </w:r>
     </w:p>
     <w:p>
       <w:r>
@@ -8620,15 +8389,7 @@
         <w:sym w:font="Wingdings" w:char="F0E0"/>
       </w:r>
       <w:r>
-        <w:t xml:space="preserve"> </w:t>
-      </w:r>
-      <w:proofErr w:type="gramStart"/>
-      <w:r>
-        <w:t>200</w:t>
-      </w:r>
-      <w:proofErr w:type="gramEnd"/>
-      <w:r>
-        <w:t>]</w:t>
+        <w:t xml:space="preserve"> 200]</w:t>
       </w:r>
     </w:p>
     <w:p>
@@ -8804,15 +8565,7 @@
         <w:sym w:font="Wingdings" w:char="F0E0"/>
       </w:r>
       <w:r>
-        <w:t xml:space="preserve"> </w:t>
-      </w:r>
-      <w:proofErr w:type="gramStart"/>
-      <w:r>
-        <w:t>200</w:t>
-      </w:r>
-      <w:proofErr w:type="gramEnd"/>
-      <w:r>
-        <w:t>]</w:t>
+        <w:t xml:space="preserve"> 200]</w:t>
       </w:r>
     </w:p>
     <w:p>
@@ -9062,7 +8815,7 @@
         <v:path o:extrusionok="f" gradientshapeok="t" o:connecttype="rect"/>
         <o:lock v:ext="edit" aspectratio="t"/>
       </v:shapetype>
-      <v:shape id="_x0000_i1025" type="#_x0000_t75" style="width:11.5pt;height:11.5pt" o:bullet="t">
+      <v:shape id="_x0000_i1025" type="#_x0000_t75" style="width:10.3pt;height:10.3pt" o:bullet="t">
         <v:imagedata r:id="rId1" o:title="msoFD7"/>
       </v:shape>
     </w:pict>

</xml_diff>